<commit_message>
Redact EC2 address from the paper, builder script and docx
Replaced in place so the journal docx keeps its text and three figures.
The address remains in git history of main; see docs/DEPLOY.md.

Co-Authored-By: Claude Sonnet 5.5 <noreply@anthropic.com>
Claude-Session: https://claude.ai/code/session_015u77xGx1udYkoPxjjKpJ3X
</commit_message>
<xml_diff>
--- a/AI_Scheduler_Journal_Paper.docx
+++ b/AI_Scheduler_Journal_Paper.docx
@@ -356,7 +356,7 @@
           <w:rFonts w:ascii="Times New Roman" w:hAnsi="Times New Roman"/>
           <w:sz w:val="21"/>
         </w:rPr>
-        <w:t>A fully functional distributed fabric deployed across local edge clients and an AWS EC2 instance running in ap-south-2 (Ubuntu 22.04 LTS, IP: 18.60.41.230), backed by a modern, high-performance visual dashboard.</w:t>
+        <w:t>A fully functional distributed fabric deployed across local edge clients and an AWS EC2 instance running in ap-south-2 (Ubuntu 22.04 LTS, IP: EC2_PUBLIC_IP), backed by a modern, high-performance visual dashboard.</w:t>
       </w:r>
     </w:p>
     <w:p>
@@ -747,7 +747,7 @@
               <w:br/>
               <w:t xml:space="preserve">                    |       LOCAL EDGE WORKER NODE       |     |        AWS EC2 CLOUD NODE          |    </w:t>
               <w:br/>
-              <w:t xml:space="preserve">                    |       (localhost:8000/execute)     |     |     (18.60.41.230:8000/execute)    |    </w:t>
+              <w:t xml:space="preserve">                    |       (localhost:8000/execute)     |     |     (EC2_PUBLIC_IP:8000/execute)    |    </w:t>
               <w:br/>
               <w:t xml:space="preserve">                    |                                    |     |                                    |    </w:t>
               <w:br/>
@@ -2843,7 +2843,7 @@
           <w:rFonts w:ascii="Times New Roman" w:hAnsi="Times New Roman"/>
           <w:sz w:val="21"/>
         </w:rPr>
-        <w:t>Module 4 handles communication and telemetry. Once the decision is reached, the payload is packaged into an asynchronous JSON payload {"code": S} and dispatched via HTTP POST to the chosen node endpoint (http://localhost:8000/execute or http://18.60.41.230:8000/execute). The worker executes the script in an isolated subprocess, captures standard output (stdout), standard error (stderr), and CPU execution duration, returning telemetry to the master controller to validate prediction accuracy in real time.</w:t>
+        <w:t>Module 4 handles communication and telemetry. Once the decision is reached, the payload is packaged into an asynchronous JSON payload {"code": S} and dispatched via HTTP POST to the chosen node endpoint (http://localhost:8000/execute or http://EC2_PUBLIC_IP:8000/execute). The worker executes the script in an isolated subprocess, captures standard output (stdout), standard error (stderr), and CPU execution duration, returning telemetry to the master controller to validate prediction accuracy in real time.</w:t>
       </w:r>
     </w:p>
     <w:tbl>
@@ -3327,7 +3327,7 @@
           <w:rFonts w:ascii="Times New Roman" w:hAnsi="Times New Roman"/>
           <w:sz w:val="21"/>
         </w:rPr>
-        <w:t>To train and validate the predictive models across realistic computational regimes, we synthesized and benchmarked 503 unique Python scripts (hardware_benchmark.csv). Each script was executed natively on both the local edge machine and the remote AWS EC2 instance (t3.micro, Ubuntu 22.04 LTS, IP: 18.60.41.230). The distribution of workloads is summarized in Table 1.</w:t>
+        <w:t>To train and validate the predictive models across realistic computational regimes, we synthesized and benchmarked 503 unique Python scripts (hardware_benchmark.csv). Each script was executed natively on both the local edge machine and the remote AWS EC2 instance (t3.micro, Ubuntu 22.04 LTS, IP: EC2_PUBLIC_IP). The distribution of workloads is summarized in Table 1.</w:t>
       </w:r>
     </w:p>
     <w:tbl>
@@ -5126,7 +5126,7 @@
           <w:rFonts w:ascii="Times New Roman" w:hAnsi="Times New Roman"/>
           <w:sz w:val="21"/>
         </w:rPr>
-        <w:t>Inference 4: The distributed REST fabric achieved 100% execution reliability over 300 automated live dispatches. Edge execution dispatches via localhost:8000 completed with an average serialization and HTTP overhead under 4.2 ms. Cloud dispatches to AWS EC2 (18.60.41.230:8000) incurred a mean wire transit time of 134.1 ms, matching the calibrated WAN probe tau_RTT within 2.1%. No memory leaks or zombie subprocesses occurred across continuous 8-hour execution bursts.</w:t>
+        <w:t>Inference 4: The distributed REST fabric achieved 100% execution reliability over 300 automated live dispatches. Edge execution dispatches via localhost:8000 completed with an average serialization and HTTP overhead under 4.2 ms. Cloud dispatches to AWS EC2 (EC2_PUBLIC_IP:8000) incurred a mean wire transit time of 134.1 ms, matching the calibrated WAN probe tau_RTT within 2.1%. No memory leaks or zombie subprocesses occurred across continuous 8-hour execution bursts.</w:t>
       </w:r>
     </w:p>
     <w:p>
@@ -7638,7 +7638,7 @@
           <w:rFonts w:ascii="Times New Roman" w:hAnsi="Times New Roman"/>
           <w:sz w:val="21"/>
         </w:rPr>
-        <w:t>Figure 2 illustrates the production AWS EC2 Cloud Security Group configuration (sg-0dc4c382103565c0c) deployed in ap-south-2. Port 8000 is authorized for Custom TCP inbound traffic (0.0.0.0/0), enabling the remote FastAPI worker (hosted on 18.60.41.230) to securely accept distributed script offloading payloads. Sub-millisecond route table configurations ensure predictable WAN packet arrival.</w:t>
+        <w:t>Figure 2 illustrates the production AWS EC2 Cloud Security Group configuration (sg-0dc4c382103565c0c) deployed in ap-south-2. Port 8000 is authorized for Custom TCP inbound traffic (0.0.0.0/0), enabling the remote FastAPI worker (hosted on EC2_PUBLIC_IP) to securely accept distributed script offloading payloads. Sub-millisecond route table configurations ensure predictable WAN packet arrival.</w:t>
       </w:r>
     </w:p>
     <w:p>
@@ -7806,7 +7806,7 @@
           <w:rFonts w:ascii="Times New Roman" w:hAnsi="Times New Roman"/>
           <w:sz w:val="21"/>
         </w:rPr>
-        <w:t>Figure 4 showcases the AI Scheduler master dashboard interface. The top cluster health bar provides real-time status indicators for both the Local Edge Worker (Online at localhost:8000) and the AWS Cloud Worker (Online at 18.60.41.230:8000 with 131 ms active RTT). The interface allows operators to test code payloads, inspect AST features, review dual-engine confidence metrics, and inspect live stdout logs.</w:t>
+        <w:t>Figure 4 showcases the AI Scheduler master dashboard interface. The top cluster health bar provides real-time status indicators for both the Local Edge Worker (Online at localhost:8000) and the AWS Cloud Worker (Online at EC2_PUBLIC_IP:8000 with 131 ms active RTT). The interface allows operators to test code payloads, inspect AST features, review dual-engine confidence metrics, and inspect live stdout logs.</w:t>
       </w:r>
     </w:p>
     <w:p>

</xml_diff>

<commit_message>
Paper, README and CHANGES: add the controlled-asymmetry experiment and error bars
Section 4.8 reports the Docker experiment (scheduler -6.9% vs always-edge,
bootstrap CI excludes zero) with its limits: one run, one machine, simulated
network. Holdout correlation updated to 0.39. Docx rebuilt.

Co-Authored-By: Claude Sonnet 5.5 <noreply@anthropic.com>
Claude-Session: https://claude.ai/code/session_015u77xGx1udYkoPxjjKpJ3X
</commit_message>
<xml_diff>
--- a/AI_Scheduler_Journal_Paper.docx
+++ b/AI_Scheduler_Journal_Paper.docx
@@ -2,7 +2,7 @@
 <file path=word/document.xml><?xml version="1.0" encoding="utf-8"?>
 <w:document xmlns:w="http://schemas.openxmlformats.org/wordprocessingml/2006/main" xmlns:m="http://schemas.openxmlformats.org/officeDocument/2006/math" xmlns:r="http://schemas.openxmlformats.org/officeDocument/2006/relationships" xmlns:o="urn:schemas-microsoft-com:office:office" xmlns:v="urn:schemas-microsoft-com:vml" xmlns:w10="urn:schemas-microsoft-com:office:word" xmlns:a="http://schemas.openxmlformats.org/drawingml/2006/main" xmlns:pic="http://schemas.openxmlformats.org/drawingml/2006/picture" xmlns:wp="http://schemas.openxmlformats.org/drawingml/2006/wordprocessingDrawing">
   <w:body>
-    <w:bookmarkStart w:id="46" w:name="X4cc72156d87814adb0830ecae8b4a76bc568142"/>
+    <w:bookmarkStart w:id="47" w:name="X4cc72156d87814adb0830ecae8b4a76bc568142"/>
     <w:p>
       <w:pPr>
         <w:pStyle w:val="Heading1"/>
@@ -256,7 +256,7 @@
         <w:t xml:space="preserve"> </w:t>
       </w:r>
       <w:r>
-        <w:t xml:space="preserve">than always-edge on the same scripts. On 16 hand-written scripts the generator never produced, the static complexity estimate has a Spearman rank correlation of 0.43 with measured runtime, which is useful but weak. We report these results as they are and describe the experiment (a real hardware asymmetry) that would test the claim the system is built for.</w:t>
+        <w:t xml:space="preserve">than always-edge on the same scripts. On 16 hand-written scripts the generator never produced, the static complexity estimate has a Spearman rank correlation of 0.39 with measured runtime, which is useful but weak. We then create the missing asymmetry: with one worker limited to 0.5 CPU and another to 4 CPUs, both in containers on one machine and a simulated 110 ms network delay, the cloud wins on 61 of 591 scripts and the scheduler finishes the workload 6.9% faster than always-edge (254.8 s vs 273.7 s; 95% bootstrap interval −10.8% to −3.8% resampling scripts, −18.5% to −1.8% resampling script families; oracle 237.8 s). This is a controlled compute asymmetry, not a measurement on EC2.</w:t>
       </w:r>
     </w:p>
     <w:p>
@@ -454,13 +454,13 @@
           <w:bCs/>
           <w:b/>
         </w:rPr>
-        <w:t xml:space="preserve">A negative result and an audit.</w:t>
-      </w:r>
-      <w:r>
-        <w:t xml:space="preserve"> </w:t>
-      </w:r>
-      <w:r>
-        <w:t xml:space="preserve">With the available data the scheduler does not beat always-edge, and the original headline numbers were artefacts (Section 4.6).</w:t>
+        <w:t xml:space="preserve">A negative result, an audit, and a controlled test.</w:t>
+      </w:r>
+      <w:r>
+        <w:t xml:space="preserve"> </w:t>
+      </w:r>
+      <w:r>
+        <w:t xml:space="preserve">On the original data the scheduler does not beat always-edge, and the original headline numbers were artefacts (Section 4.6); with a deliberately created compute asymmetry it does (Section 4.8).</w:t>
       </w:r>
     </w:p>
     <w:p>
@@ -2346,7 +2346,7 @@
     </w:p>
     <w:bookmarkEnd w:id="29"/>
     <w:bookmarkEnd w:id="30"/>
-    <w:bookmarkStart w:id="38" w:name="results"/>
+    <w:bookmarkStart w:id="39" w:name="results"/>
     <w:p>
       <w:pPr>
         <w:pStyle w:val="Heading2"/>
@@ -3305,7 +3305,7 @@
           <w:bCs/>
           <w:b/>
         </w:rPr>
-        <w:t xml:space="preserve">0.43</w:t>
+        <w:t xml:space="preserve">0.39</w:t>
       </w:r>
       <w:r>
         <w:t xml:space="preserve"> </w:t>
@@ -3328,7 +3328,7 @@
         </m:r>
       </m:oMath>
       <w:r>
-        <w:t xml:space="preserve">). This is a weak positive relation, not a good predictor, and a sample of 16 gives a wide interval. The misses are informative: loop bounds derived from</w:t>
+        <w:t xml:space="preserve">; 0.43 in the first run, the difference is timing noise on a shared machine plus a corrected NumPy size rule). This is a weak positive relation, not a good predictor, and a sample of 16 gives a wide interval. The misses are informative: loop bounds derived from</w:t>
       </w:r>
       <w:r>
         <w:t xml:space="preserve"> </w:t>
@@ -3801,6 +3801,419 @@
         <w:t xml:space="preserve">; it is about 0.6 ms. A concurrency test against a local worker over real sockets (40 requests, 2 CPUs) completes 14, 26 and 27 requests at 1, 2 and 4 slots and returns HTTP 503 for the rest instead of queueing without bound. The FastAPI front end could not be installed in the audit environment; the same wire contract is exercised through a stdlib server around the identical runner code, and the repository’s test suite passes.</w:t>
       </w:r>
     </w:p>
+    <w:bookmarkEnd w:id="37"/>
+    <w:bookmarkStart w:id="38" w:name="controlled-asymmetry-experiment"/>
+    <w:p>
+      <w:pPr>
+        <w:pStyle w:val="Heading3"/>
+      </w:pPr>
+      <w:r>
+        <w:t xml:space="preserve">4.8 Controlled asymmetry experiment</w:t>
+      </w:r>
+    </w:p>
+    <w:p>
+      <w:pPr>
+        <w:pStyle w:val="FirstParagraph"/>
+      </w:pPr>
+      <w:r>
+        <w:t xml:space="preserve">The original 495 timings come from two similar machines, so they cannot show a benefit. To test the scheduler where a benefit is possible we ran two workers on one machine (an Apple-silicon laptop running Docker Desktop): an</w:t>
+      </w:r>
+      <w:r>
+        <w:t xml:space="preserve"> </w:t>
+      </w:r>
+      <w:r>
+        <w:rPr>
+          <w:bCs/>
+          <w:b/>
+        </w:rPr>
+        <w:t xml:space="preserve">edge</w:t>
+      </w:r>
+      <w:r>
+        <w:t xml:space="preserve"> </w:t>
+      </w:r>
+      <w:r>
+        <w:t xml:space="preserve">worker limited to 0.5 CPU (one BLAS thread) and a</w:t>
+      </w:r>
+      <w:r>
+        <w:t xml:space="preserve"> </w:t>
+      </w:r>
+      <w:r>
+        <w:rPr>
+          <w:bCs/>
+          <w:b/>
+        </w:rPr>
+        <w:t xml:space="preserve">cloud</w:t>
+      </w:r>
+      <w:r>
+        <w:t xml:space="preserve"> </w:t>
+      </w:r>
+      <w:r>
+        <w:t xml:space="preserve">worker limited to 4 CPUs (four BLAS threads), each running one job at a time through the same hardened worker code. Every one of the 591 scripts in</w:t>
+      </w:r>
+      <w:r>
+        <w:t xml:space="preserve"> </w:t>
+      </w:r>
+      <w:r>
+        <w:rPr>
+          <w:rStyle w:val="VerbatimChar"/>
+        </w:rPr>
+        <w:t xml:space="preserve">test_scripts/</w:t>
+      </w:r>
+      <w:r>
+        <w:t xml:space="preserve"> </w:t>
+      </w:r>
+      <w:r>
+        <w:t xml:space="preserve">was timed three times on each worker (median kept;</w:t>
+      </w:r>
+      <w:r>
+        <w:t xml:space="preserve"> </w:t>
+      </w:r>
+      <w:r>
+        <w:rPr>
+          <w:rStyle w:val="VerbatimChar"/>
+        </w:rPr>
+        <w:t xml:space="preserve">scripts/run_asymmetric_experiment.sh</w:t>
+      </w:r>
+      <w:r>
+        <w:t xml:space="preserve">, data in</w:t>
+      </w:r>
+      <w:r>
+        <w:t xml:space="preserve"> </w:t>
+      </w:r>
+      <w:r>
+        <w:rPr>
+          <w:rStyle w:val="VerbatimChar"/>
+        </w:rPr>
+        <w:t xml:space="preserve">data/docker_asym_v1/</w:t>
+      </w:r>
+      <w:r>
+        <w:t xml:space="preserve">). The measured round trip between the containers was 3.6 ms; scoring uses a</w:t>
+      </w:r>
+      <w:r>
+        <w:t xml:space="preserve"> </w:t>
+      </w:r>
+      <w:r>
+        <w:rPr>
+          <w:bCs/>
+          <w:b/>
+        </w:rPr>
+        <w:t xml:space="preserve">simulated 110 ms</w:t>
+      </w:r>
+      <w:r>
+        <w:t xml:space="preserve"> </w:t>
+      </w:r>
+      <w:r>
+        <w:t xml:space="preserve">WAN delay, the value measured to EC2 earlier. Evaluation follows Section 4.2 (5-fold, whole families held out, 21 families).</w:t>
+      </w:r>
+    </w:p>
+    <w:tbl>
+      <w:tblPr>
+        <w:tblStyle w:val="Table"/>
+        <w:tblW w:type="auto" w:w="0"/>
+        <w:tblLook w:firstRow="1" w:lastRow="0" w:firstColumn="0" w:lastColumn="0" w:noHBand="0" w:noVBand="0" w:val="0020"/>
+        <w:jc w:val="start"/>
+      </w:tblPr>
+      <w:tblGrid>
+        <w:gridCol w:w="2640"/>
+        <w:gridCol w:w="2640"/>
+        <w:gridCol w:w="2640"/>
+      </w:tblGrid>
+      <w:tr>
+        <w:trPr>
+          <w:tblHeader w:val="true"/>
+        </w:trPr>
+        <w:tc>
+          <w:tcPr/>
+          <w:p>
+            <w:pPr>
+              <w:pStyle w:val="Compact"/>
+              <w:jc w:val="left"/>
+            </w:pPr>
+            <w:r>
+              <w:t xml:space="preserve">Policy</w:t>
+            </w:r>
+          </w:p>
+        </w:tc>
+        <w:tc>
+          <w:tcPr/>
+          <w:p>
+            <w:pPr>
+              <w:pStyle w:val="Compact"/>
+              <w:jc w:val="right"/>
+            </w:pPr>
+            <w:r>
+              <w:t xml:space="preserve">Total (s)</w:t>
+            </w:r>
+          </w:p>
+        </w:tc>
+        <w:tc>
+          <w:tcPr/>
+          <w:p>
+            <w:pPr>
+              <w:pStyle w:val="Compact"/>
+              <w:jc w:val="right"/>
+            </w:pPr>
+            <w:r>
+              <w:t xml:space="preserve">vs always-edge</w:t>
+            </w:r>
+          </w:p>
+        </w:tc>
+      </w:tr>
+      <w:tr>
+        <w:tc>
+          <w:tcPr/>
+          <w:p>
+            <w:pPr>
+              <w:pStyle w:val="Compact"/>
+              <w:jc w:val="left"/>
+            </w:pPr>
+            <w:r>
+              <w:t xml:space="preserve">Oracle</w:t>
+            </w:r>
+          </w:p>
+        </w:tc>
+        <w:tc>
+          <w:tcPr/>
+          <w:p>
+            <w:pPr>
+              <w:pStyle w:val="Compact"/>
+              <w:jc w:val="right"/>
+            </w:pPr>
+            <w:r>
+              <w:t xml:space="preserve">237.8</w:t>
+            </w:r>
+          </w:p>
+        </w:tc>
+        <w:tc>
+          <w:tcPr/>
+          <w:p>
+            <w:pPr>
+              <w:pStyle w:val="Compact"/>
+              <w:jc w:val="right"/>
+            </w:pPr>
+            <w:r>
+              <w:t xml:space="preserve">−13.1%</w:t>
+            </w:r>
+          </w:p>
+        </w:tc>
+      </w:tr>
+      <w:tr>
+        <w:tc>
+          <w:tcPr/>
+          <w:p>
+            <w:pPr>
+              <w:pStyle w:val="Compact"/>
+              <w:jc w:val="left"/>
+            </w:pPr>
+            <w:r>
+              <w:rPr>
+                <w:bCs/>
+                <w:b/>
+              </w:rPr>
+              <w:t xml:space="preserve">Scheduler</w:t>
+            </w:r>
+          </w:p>
+        </w:tc>
+        <w:tc>
+          <w:tcPr/>
+          <w:p>
+            <w:pPr>
+              <w:pStyle w:val="Compact"/>
+              <w:jc w:val="right"/>
+            </w:pPr>
+            <w:r>
+              <w:rPr>
+                <w:bCs/>
+                <w:b/>
+              </w:rPr>
+              <w:t xml:space="preserve">254.8</w:t>
+            </w:r>
+          </w:p>
+        </w:tc>
+        <w:tc>
+          <w:tcPr/>
+          <w:p>
+            <w:pPr>
+              <w:pStyle w:val="Compact"/>
+              <w:jc w:val="right"/>
+            </w:pPr>
+            <w:r>
+              <w:rPr>
+                <w:bCs/>
+                <w:b/>
+              </w:rPr>
+              <w:t xml:space="preserve">−6.9%</w:t>
+            </w:r>
+          </w:p>
+        </w:tc>
+      </w:tr>
+      <w:tr>
+        <w:tc>
+          <w:tcPr/>
+          <w:p>
+            <w:pPr>
+              <w:pStyle w:val="Compact"/>
+              <w:jc w:val="left"/>
+            </w:pPr>
+            <w:r>
+              <w:t xml:space="preserve">Always edge</w:t>
+            </w:r>
+          </w:p>
+        </w:tc>
+        <w:tc>
+          <w:tcPr/>
+          <w:p>
+            <w:pPr>
+              <w:pStyle w:val="Compact"/>
+              <w:jc w:val="right"/>
+            </w:pPr>
+            <w:r>
+              <w:t xml:space="preserve">273.7</w:t>
+            </w:r>
+          </w:p>
+        </w:tc>
+        <w:tc>
+          <w:tcPr/>
+          <w:p>
+            <w:pPr>
+              <w:pStyle w:val="Compact"/>
+              <w:jc w:val="right"/>
+            </w:pPr>
+            <w:r>
+              <w:t xml:space="preserve">baseline</w:t>
+            </w:r>
+          </w:p>
+        </w:tc>
+      </w:tr>
+      <w:tr>
+        <w:tc>
+          <w:tcPr/>
+          <w:p>
+            <w:pPr>
+              <w:pStyle w:val="Compact"/>
+              <w:jc w:val="left"/>
+            </w:pPr>
+            <w:r>
+              <w:t xml:space="preserve">Always cloud</w:t>
+            </w:r>
+          </w:p>
+        </w:tc>
+        <w:tc>
+          <w:tcPr/>
+          <w:p>
+            <w:pPr>
+              <w:pStyle w:val="Compact"/>
+              <w:jc w:val="right"/>
+            </w:pPr>
+            <w:r>
+              <w:t xml:space="preserve">291.1</w:t>
+            </w:r>
+          </w:p>
+        </w:tc>
+        <w:tc>
+          <w:tcPr/>
+          <w:p>
+            <w:pPr>
+              <w:pStyle w:val="Compact"/>
+              <w:jc w:val="right"/>
+            </w:pPr>
+            <w:r>
+              <w:t xml:space="preserve">+6.4%</w:t>
+            </w:r>
+          </w:p>
+        </w:tc>
+      </w:tr>
+    </w:tbl>
+    <w:p>
+      <w:pPr>
+        <w:numPr>
+          <w:ilvl w:val="0"/>
+          <w:numId w:val="1006"/>
+        </w:numPr>
+        <w:pStyle w:val="Compact"/>
+      </w:pPr>
+      <w:r>
+        <w:t xml:space="preserve">The cloud worker is faster than the edge even after the 110 ms delay on</w:t>
+      </w:r>
+      <w:r>
+        <w:t xml:space="preserve"> </w:t>
+      </w:r>
+      <w:r>
+        <w:rPr>
+          <w:bCs/>
+          <w:b/>
+        </w:rPr>
+        <w:t xml:space="preserve">61 of 591</w:t>
+      </w:r>
+      <w:r>
+        <w:t xml:space="preserve"> </w:t>
+      </w:r>
+      <w:r>
+        <w:t xml:space="preserve">scripts; the scheduler sent 43 scripts to the cloud: 32 were correct calls (19.7 s saved), 11 were mistakes (0.9 s lost), and it missed the other 29 cloud-favourable scripts. Ten scripts account for 68% of the movement.</w:t>
+      </w:r>
+    </w:p>
+    <w:p>
+      <w:pPr>
+        <w:numPr>
+          <w:ilvl w:val="0"/>
+          <w:numId w:val="1006"/>
+        </w:numPr>
+        <w:pStyle w:val="Compact"/>
+      </w:pPr>
+      <w:r>
+        <w:t xml:space="preserve">Latency models: R² = 0.924 (edge) and 0.941 (cloud) on log₁₀ runtime with families held out; median absolute error 4.4% (edge) and 2.4% (cloud).</w:t>
+      </w:r>
+    </w:p>
+    <w:p>
+      <w:pPr>
+        <w:numPr>
+          <w:ilvl w:val="0"/>
+          <w:numId w:val="1006"/>
+        </w:numPr>
+        <w:pStyle w:val="Compact"/>
+      </w:pPr>
+      <w:r>
+        <w:t xml:space="preserve">Uncertainty: 2000 bootstrap resamples give a 95% interval of [−10.8%, −3.8%] for the scheduler versus always-edge when scripts are resampled and [−18.5%, −1.8%] when whole families are resampled. Both exclude zero. They do not capture run-to-run measurement noise (the experiment was run once) or different CPU limits.</w:t>
+      </w:r>
+    </w:p>
+    <w:p>
+      <w:pPr>
+        <w:numPr>
+          <w:ilvl w:val="0"/>
+          <w:numId w:val="1006"/>
+        </w:numPr>
+        <w:pStyle w:val="Compact"/>
+      </w:pPr>
+      <w:r>
+        <w:t xml:space="preserve">Ten generated</w:t>
+      </w:r>
+      <w:r>
+        <w:t xml:space="preserve"> </w:t>
+      </w:r>
+      <w:r>
+        <w:t xml:space="preserve">“</w:t>
+      </w:r>
+      <w:r>
+        <w:t xml:space="preserve">ten-second</w:t>
+      </w:r>
+      <w:r>
+        <w:t xml:space="preserve">”</w:t>
+      </w:r>
+      <w:r>
+        <w:t xml:space="preserve"> </w:t>
+      </w:r>
+      <w:r>
+        <w:t xml:space="preserve">scripts take 10.0 s on both workers (100 s of the 273.7 s) and cannot be influenced by routing, so the scheduler affects about 173 s of the total: it recovers 19 s of the 36 s that the oracle could.</w:t>
+      </w:r>
+    </w:p>
+    <w:p>
+      <w:pPr>
+        <w:pStyle w:val="FirstParagraph"/>
+      </w:pPr>
+      <w:r>
+        <w:t xml:space="preserve">What this does and does not show. It shows that, given a real difference in compute, the pipeline (static features, regressors trained on measured times, the single inequality of Section 3.1) finds most of the available gain and avoids the penalty of always offloading. It does not show a gain on EC2: the asymmetry was chosen by us, the two workers share one machine and memory system, and the network delay is a constant rather than a measured, variable link.</w:t>
+      </w:r>
+    </w:p>
     <w:p>
       <w:r>
         <w:pict>
@@ -3808,9 +4221,9 @@
         </w:pict>
       </w:r>
     </w:p>
-    <w:bookmarkEnd w:id="37"/>
     <w:bookmarkEnd w:id="38"/>
-    <w:bookmarkStart w:id="43" w:name="performance-limits-and-what-remains"/>
+    <w:bookmarkEnd w:id="39"/>
+    <w:bookmarkStart w:id="44" w:name="performance-limits-and-what-remains"/>
     <w:p>
       <w:pPr>
         <w:pStyle w:val="Heading2"/>
@@ -3819,7 +4232,7 @@
         <w:t xml:space="preserve">5. Performance, limits and what remains</w:t>
       </w:r>
     </w:p>
-    <w:bookmarkStart w:id="39" w:name="comparison-with-the-baselines"/>
+    <w:bookmarkStart w:id="40" w:name="comparison-with-the-baselines"/>
     <w:p>
       <w:pPr>
         <w:pStyle w:val="Heading3"/>
@@ -3833,27 +4246,11 @@
         <w:pStyle w:val="FirstParagraph"/>
       </w:pPr>
       <w:r>
-        <w:t xml:space="preserve">On the data available, the ranking is oracle ≈ always-edge &lt; scheduler &lt; always-cloud. The scheduler’s value on this data is that it</w:t>
-      </w:r>
-      <w:r>
-        <w:t xml:space="preserve"> </w:t>
-      </w:r>
-      <w:r>
-        <w:rPr>
-          <w:bCs/>
-          <w:b/>
-        </w:rPr>
-        <w:t xml:space="preserve">avoids the 72.6% penalty of always-cloud</w:t>
-      </w:r>
-      <w:r>
-        <w:t xml:space="preserve"> </w:t>
-      </w:r>
-      <w:r>
-        <w:t xml:space="preserve">and the 35.6% penalty of the original design while staying within 3.1% of the best fixed policy. It does not demonstrate a gain over running locally.</w:t>
-      </w:r>
-    </w:p>
-    <w:bookmarkEnd w:id="39"/>
-    <w:bookmarkStart w:id="40" w:name="where-offloading-would-pay"/>
+        <w:t xml:space="preserve">On the original data the ranking is oracle ≈ always-edge &lt; scheduler &lt; always-cloud: the scheduler avoids the 72.6% penalty of always-cloud and the 35.6% penalty of the original design while staying within 3.1% of the best fixed policy, but shows no gain over running locally. On the controlled-asymmetry data (Section 4.8) the ranking is oracle &lt; scheduler &lt; always-edge &lt; always-cloud, with the scheduler 6.9% ahead of always-edge. The difference between the two is the data, not the method: the first set has one cloud-favourable script, the second has 61.</w:t>
+      </w:r>
+    </w:p>
+    <w:bookmarkEnd w:id="40"/>
+    <w:bookmarkStart w:id="41" w:name="where-offloading-would-pay"/>
     <w:p>
       <w:pPr>
         <w:pStyle w:val="Heading3"/>
@@ -4001,108 +4398,22 @@
         <w:t xml:space="preserve">ms the cloud must save more than 110 ms of compute, so no job faster than about 0.1 s on the edge can ever benefit. In the dataset the heaviest jobs take about the same time on both nodes (maxima of about 10 s each), so even among long jobs the cloud saves almost nothing; only one script clears the bar. A cloud node with several times the edge’s compute (more cores for BLAS, a faster CPU) would pull the break-even down towards jobs of a few hundred milliseconds. This is a prediction of the model, to be tested, not a measured result.</w:t>
       </w:r>
     </w:p>
-    <w:bookmarkEnd w:id="40"/>
-    <w:bookmarkStart w:id="41" w:name="experiment-needed-to-test-the-claim"/>
+    <w:bookmarkEnd w:id="41"/>
+    <w:bookmarkStart w:id="42" w:name="remaining-experiment"/>
     <w:p>
       <w:pPr>
         <w:pStyle w:val="Heading3"/>
       </w:pPr>
       <w:r>
-        <w:t xml:space="preserve">5.3 Experiment needed to test the claim</w:t>
-      </w:r>
-    </w:p>
-    <w:p>
-      <w:pPr>
-        <w:numPr>
-          <w:ilvl w:val="0"/>
-          <w:numId w:val="1006"/>
-        </w:numPr>
-        <w:pStyle w:val="Compact"/>
-      </w:pPr>
-      <w:r>
-        <w:t xml:space="preserve">Make the nodes genuinely different (</w:t>
-      </w:r>
-      <w:r>
-        <w:rPr>
-          <w:rStyle w:val="VerbatimChar"/>
-        </w:rPr>
-        <w:t xml:space="preserve">docs/DEPLOY.md</w:t>
-      </w:r>
-      <w:r>
-        <w:t xml:space="preserve">: for example a throttled local worker versus a multi-core instance).</w:t>
-      </w:r>
-    </w:p>
-    <w:p>
-      <w:pPr>
-        <w:numPr>
-          <w:ilvl w:val="0"/>
-          <w:numId w:val="1006"/>
-        </w:numPr>
-        <w:pStyle w:val="Compact"/>
-      </w:pPr>
-      <w:r>
-        <w:t xml:space="preserve">Re-collect with</w:t>
-      </w:r>
-      <w:r>
-        <w:t xml:space="preserve"> </w:t>
-      </w:r>
-      <w:r>
-        <w:rPr>
-          <w:rStyle w:val="VerbatimChar"/>
-        </w:rPr>
-        <w:t xml:space="preserve">collect_data.py</w:t>
-      </w:r>
-      <w:r>
-        <w:t xml:space="preserve"> </w:t>
-      </w:r>
-      <w:r>
-        <w:t xml:space="preserve">(repeated runs, spread and failures recorded, hardware metadata stored), retrain with</w:t>
-      </w:r>
-      <w:r>
-        <w:t xml:space="preserve"> </w:t>
-      </w:r>
-      <w:r>
-        <w:rPr>
-          <w:rStyle w:val="VerbatimChar"/>
-        </w:rPr>
-        <w:t xml:space="preserve">train_model.py --probe</w:t>
-      </w:r>
-      <w:r>
-        <w:t xml:space="preserve">, and re-run</w:t>
-      </w:r>
-      <w:r>
-        <w:t xml:space="preserve"> </w:t>
-      </w:r>
-      <w:r>
-        <w:rPr>
-          <w:rStyle w:val="VerbatimChar"/>
-        </w:rPr>
-        <w:t xml:space="preserve">bench/run_benchmarks.py</w:t>
-      </w:r>
-      <w:r>
-        <w:t xml:space="preserve">.</w:t>
-      </w:r>
-    </w:p>
-    <w:p>
-      <w:pPr>
-        <w:numPr>
-          <w:ilvl w:val="0"/>
-          <w:numId w:val="1006"/>
-        </w:numPr>
-        <w:pStyle w:val="Compact"/>
-      </w:pPr>
-      <w:r>
-        <w:t xml:space="preserve">Report scheduler vs always-edge, always-cloud and oracle with families held out, as in Section 4.2.</w:t>
-      </w:r>
-    </w:p>
-    <w:bookmarkEnd w:id="41"/>
-    <w:bookmarkStart w:id="42" w:name="limitations-and-threats-to-validity"/>
-    <w:p>
-      <w:pPr>
-        <w:pStyle w:val="Heading3"/>
-      </w:pPr>
-      <w:r>
-        <w:t xml:space="preserve">5.4 Limitations and threats to validity</w:t>
+        <w:t xml:space="preserve">5.3 Remaining experiment</w:t>
+      </w:r>
+    </w:p>
+    <w:p>
+      <w:pPr>
+        <w:pStyle w:val="FirstParagraph"/>
+      </w:pPr>
+      <w:r>
+        <w:t xml:space="preserve">Section 4.8 supplies a controlled test; the claim the system is built for still needs a real one.</w:t>
       </w:r>
     </w:p>
     <w:p>
@@ -4114,17 +4425,7 @@
         <w:pStyle w:val="Compact"/>
       </w:pPr>
       <w:r>
-        <w:rPr>
-          <w:bCs/>
-          <w:b/>
-        </w:rPr>
-        <w:t xml:space="preserve">No hardware asymmetry in the data</w:t>
-      </w:r>
-      <w:r>
-        <w:t xml:space="preserve"> </w:t>
-      </w:r>
-      <w:r>
-        <w:t xml:space="preserve">(above). This is the dominant limitation.</w:t>
+        <w:t xml:space="preserve">Repeat the container experiment two or three times (and with other CPU limits) to measure run-to-run variation, which the bootstrap interval does not cover.</w:t>
       </w:r>
     </w:p>
     <w:p>
@@ -4136,17 +4437,25 @@
         <w:pStyle w:val="Compact"/>
       </w:pPr>
       <w:r>
-        <w:rPr>
-          <w:bCs/>
-          <w:b/>
-        </w:rPr>
-        <w:t xml:space="preserve">Template-generated workloads.</w:t>
-      </w:r>
-      <w:r>
-        <w:t xml:space="preserve"> </w:t>
-      </w:r>
-      <w:r>
-        <w:t xml:space="preserve">Holding out families reduces leakage, but the families are still one author’s templates; the 16-script holdout is small and has no cloud measurements.</w:t>
+        <w:t xml:space="preserve">Add the heavier multi-core workloads written for this purpose (</w:t>
+      </w:r>
+      <w:r>
+        <w:rPr>
+          <w:rStyle w:val="VerbatimChar"/>
+        </w:rPr>
+        <w:t xml:space="preserve">generate_heavy_scripts.py</w:t>
+      </w:r>
+      <w:r>
+        <w:t xml:space="preserve">: dense linear algebra, FFT, large element-wise NumPy, and single-threaded loops as a control) and merge them into the dataset (</w:t>
+      </w:r>
+      <w:r>
+        <w:rPr>
+          <w:rStyle w:val="VerbatimChar"/>
+        </w:rPr>
+        <w:t xml:space="preserve">scripts/merge_datasets.py</w:t>
+      </w:r>
+      <w:r>
+        <w:t xml:space="preserve">). Only 10% of scripts currently favour the cloud, mostly because most jobs finish in milliseconds.</w:t>
       </w:r>
     </w:p>
     <w:p>
@@ -4158,45 +4467,79 @@
         <w:pStyle w:val="Compact"/>
       </w:pPr>
       <w:r>
+        <w:t xml:space="preserve">Measure against a real remote instance (</w:t>
+      </w:r>
+      <w:r>
+        <w:rPr>
+          <w:rStyle w:val="VerbatimChar"/>
+        </w:rPr>
+        <w:t xml:space="preserve">deploy/terraform</w:t>
+      </w:r>
+      <w:r>
+        <w:t xml:space="preserve">,</w:t>
+      </w:r>
+      <w:r>
+        <w:t xml:space="preserve"> </w:t>
+      </w:r>
+      <w:r>
+        <w:rPr>
+          <w:rStyle w:val="VerbatimChar"/>
+        </w:rPr>
+        <w:t xml:space="preserve">collect_data.py</w:t>
+      </w:r>
+      <w:r>
+        <w:t xml:space="preserve">,</w:t>
+      </w:r>
+      <w:r>
+        <w:t xml:space="preserve"> </w:t>
+      </w:r>
+      <w:r>
+        <w:rPr>
+          <w:rStyle w:val="VerbatimChar"/>
+        </w:rPr>
+        <w:t xml:space="preserve">train_model.py --probe</w:t>
+      </w:r>
+      <w:r>
+        <w:t xml:space="preserve">) so that the delay is a measured, variable link and the hardware is not shared.</w:t>
+      </w:r>
+    </w:p>
+    <w:bookmarkEnd w:id="42"/>
+    <w:bookmarkStart w:id="43" w:name="limitations-and-threats-to-validity"/>
+    <w:p>
+      <w:pPr>
+        <w:pStyle w:val="Heading3"/>
+      </w:pPr>
+      <w:r>
+        <w:t xml:space="preserve">5.4 Limitations and threats to validity</w:t>
+      </w:r>
+    </w:p>
+    <w:p>
+      <w:pPr>
+        <w:numPr>
+          <w:ilvl w:val="0"/>
+          <w:numId w:val="1008"/>
+        </w:numPr>
+        <w:pStyle w:val="Compact"/>
+      </w:pPr>
+      <w:r>
         <w:rPr>
           <w:bCs/>
           <w:b/>
         </w:rPr>
-        <w:t xml:space="preserve">Static-analysis blind spots.</w:t>
-      </w:r>
-      <w:r>
-        <w:t xml:space="preserve"> </w:t>
-      </w:r>
-      <w:r>
-        <w:t xml:space="preserve">Data-dependent loop bounds,</w:t>
-      </w:r>
-      <w:r>
-        <w:t xml:space="preserve"> </w:t>
-      </w:r>
-      <w:r>
-        <w:rPr>
-          <w:rStyle w:val="VerbatimChar"/>
-        </w:rPr>
-        <w:t xml:space="preserve">exec</w:t>
-      </w:r>
-      <w:r>
-        <w:t xml:space="preserve">/</w:t>
-      </w:r>
-      <w:r>
-        <w:rPr>
-          <w:rStyle w:val="VerbatimChar"/>
-        </w:rPr>
-        <w:t xml:space="preserve">eval</w:t>
-      </w:r>
-      <w:r>
-        <w:t xml:space="preserve">, I/O and library calls with input-dependent cost are invisible to the analyser. History and retraining from the log are mitigations, not a proof of coverage.</w:t>
+        <w:t xml:space="preserve">Asymmetry is chosen, not found.</w:t>
+      </w:r>
+      <w:r>
+        <w:t xml:space="preserve"> </w:t>
+      </w:r>
+      <w:r>
+        <w:t xml:space="preserve">The original data has none; the controlled experiment (Section 4.8) creates one with CPU limits on a single machine and a constant simulated delay. It supports the method, not a claim about EC2 or any particular deployment.</w:t>
       </w:r>
     </w:p>
     <w:p>
       <w:pPr>
         <w:numPr>
           <w:ilvl w:val="0"/>
-          <w:numId w:val="1007"/>
+          <w:numId w:val="1008"/>
         </w:numPr>
         <w:pStyle w:val="Compact"/>
       </w:pPr>
@@ -4205,20 +4548,20 @@
           <w:bCs/>
           <w:b/>
         </w:rPr>
-        <w:t xml:space="preserve">Single run conditions.</w:t>
-      </w:r>
-      <w:r>
-        <w:t xml:space="preserve"> </w:t>
-      </w:r>
-      <w:r>
-        <w:t xml:space="preserve">RTT was measured to a single region; network jitter, cold starts and CPU contention on a shared instance are only modelled through the EWMA and the queue heuristic.</w:t>
+        <w:t xml:space="preserve">One run.</w:t>
+      </w:r>
+      <w:r>
+        <w:t xml:space="preserve"> </w:t>
+      </w:r>
+      <w:r>
+        <w:t xml:space="preserve">The 6.9% figure comes from one collection (3 repeats per script); the intervals reflect script sampling only.</w:t>
       </w:r>
     </w:p>
     <w:p>
       <w:pPr>
         <w:numPr>
           <w:ilvl w:val="0"/>
-          <w:numId w:val="1007"/>
+          <w:numId w:val="1008"/>
         </w:numPr>
         <w:pStyle w:val="Compact"/>
       </w:pPr>
@@ -4227,20 +4570,20 @@
           <w:bCs/>
           <w:b/>
         </w:rPr>
-        <w:t xml:space="preserve">Confidence is approximate.</w:t>
-      </w:r>
-      <w:r>
-        <w:t xml:space="preserve"> </w:t>
-      </w:r>
-      <w:r>
-        <w:t xml:space="preserve">It assumes normal, homoscedastic log-errors.</w:t>
+        <w:t xml:space="preserve">Template-generated workloads.</w:t>
+      </w:r>
+      <w:r>
+        <w:t xml:space="preserve"> </w:t>
+      </w:r>
+      <w:r>
+        <w:t xml:space="preserve">Holding out families reduces leakage, but the families are still one author’s templates; the 16-script holdout is small and has no cloud measurements.</w:t>
       </w:r>
     </w:p>
     <w:p>
       <w:pPr>
         <w:numPr>
           <w:ilvl w:val="0"/>
-          <w:numId w:val="1007"/>
+          <w:numId w:val="1008"/>
         </w:numPr>
         <w:pStyle w:val="Compact"/>
       </w:pPr>
@@ -4249,20 +4592,107 @@
           <w:bCs/>
           <w:b/>
         </w:rPr>
-        <w:t xml:space="preserve">Security.</w:t>
-      </w:r>
-      <w:r>
-        <w:t xml:space="preserve"> </w:t>
-      </w:r>
-      <w:r>
-        <w:t xml:space="preserve">The worker is hardened, not sandboxed. The first draft’s EC2 address and security-group identifiers appeared in the repository history; the address has been redacted in the current tree but remains in earlier commits, so the instance should be rotated or locked down.</w:t>
+        <w:t xml:space="preserve">Static-analysis blind spots.</w:t>
+      </w:r>
+      <w:r>
+        <w:t xml:space="preserve"> </w:t>
+      </w:r>
+      <w:r>
+        <w:t xml:space="preserve">Data-dependent loop bounds,</w:t>
+      </w:r>
+      <w:r>
+        <w:t xml:space="preserve"> </w:t>
+      </w:r>
+      <w:r>
+        <w:rPr>
+          <w:rStyle w:val="VerbatimChar"/>
+        </w:rPr>
+        <w:t xml:space="preserve">exec</w:t>
+      </w:r>
+      <w:r>
+        <w:t xml:space="preserve">/</w:t>
+      </w:r>
+      <w:r>
+        <w:rPr>
+          <w:rStyle w:val="VerbatimChar"/>
+        </w:rPr>
+        <w:t xml:space="preserve">eval</w:t>
+      </w:r>
+      <w:r>
+        <w:t xml:space="preserve">, I/O and library calls with input-dependent cost are invisible to the analyser. History and retraining from the log are mitigations, not a proof of coverage.</w:t>
       </w:r>
     </w:p>
     <w:p>
       <w:pPr>
         <w:numPr>
           <w:ilvl w:val="0"/>
-          <w:numId w:val="1007"/>
+          <w:numId w:val="1008"/>
+        </w:numPr>
+        <w:pStyle w:val="Compact"/>
+      </w:pPr>
+      <w:r>
+        <w:rPr>
+          <w:bCs/>
+          <w:b/>
+        </w:rPr>
+        <w:t xml:space="preserve">Single run conditions.</w:t>
+      </w:r>
+      <w:r>
+        <w:t xml:space="preserve"> </w:t>
+      </w:r>
+      <w:r>
+        <w:t xml:space="preserve">RTT was measured to a single region; network jitter, cold starts and CPU contention on a shared instance are only modelled through the EWMA and the queue heuristic.</w:t>
+      </w:r>
+    </w:p>
+    <w:p>
+      <w:pPr>
+        <w:numPr>
+          <w:ilvl w:val="0"/>
+          <w:numId w:val="1008"/>
+        </w:numPr>
+        <w:pStyle w:val="Compact"/>
+      </w:pPr>
+      <w:r>
+        <w:rPr>
+          <w:bCs/>
+          <w:b/>
+        </w:rPr>
+        <w:t xml:space="preserve">Confidence is approximate.</w:t>
+      </w:r>
+      <w:r>
+        <w:t xml:space="preserve"> </w:t>
+      </w:r>
+      <w:r>
+        <w:t xml:space="preserve">It assumes normal, homoscedastic log-errors.</w:t>
+      </w:r>
+    </w:p>
+    <w:p>
+      <w:pPr>
+        <w:numPr>
+          <w:ilvl w:val="0"/>
+          <w:numId w:val="1008"/>
+        </w:numPr>
+        <w:pStyle w:val="Compact"/>
+      </w:pPr>
+      <w:r>
+        <w:rPr>
+          <w:bCs/>
+          <w:b/>
+        </w:rPr>
+        <w:t xml:space="preserve">Security.</w:t>
+      </w:r>
+      <w:r>
+        <w:t xml:space="preserve"> </w:t>
+      </w:r>
+      <w:r>
+        <w:t xml:space="preserve">The worker is hardened, not sandboxed. The first draft’s EC2 address and security-group identifiers appeared in the repository history; the address has been redacted in the current tree but remains in earlier commits, so the instance should be rotated or locked down.</w:t>
+      </w:r>
+    </w:p>
+    <w:p>
+      <w:pPr>
+        <w:numPr>
+          <w:ilvl w:val="0"/>
+          <w:numId w:val="1008"/>
         </w:numPr>
         <w:pStyle w:val="Compact"/>
       </w:pPr>
@@ -4302,9 +4732,9 @@
         </w:pict>
       </w:r>
     </w:p>
-    <w:bookmarkEnd w:id="42"/>
     <w:bookmarkEnd w:id="43"/>
-    <w:bookmarkStart w:id="44" w:name="conclusion"/>
+    <w:bookmarkEnd w:id="44"/>
+    <w:bookmarkStart w:id="45" w:name="conclusion"/>
     <w:p>
       <w:pPr>
         <w:pStyle w:val="Heading2"/>
@@ -4326,7 +4756,7 @@
         <w:pStyle w:val="BodyText"/>
       </w:pPr>
       <w:r>
-        <w:t xml:space="preserve">The main finding is a negative one. On 495 measured scripts the cloud wins once, so the scheduler ends within 3.1% of always-edge and cannot be shown to improve on it, while the original design’s headline numbers (99.4% accuracy, 41.8% latency reduction) came from synthetic labels and leaky evaluation and were in fact a 35.6% slowdown. Whether the approach delivers a real benefit depends on running it where the cloud node is substantively faster than the edge, and the repository now contains the tooling, protocol and baselines to do exactly that.</w:t>
+        <w:t xml:space="preserve">The findings are mixed, and we report both. On 495 measured scripts from two similar machines the cloud wins once, so the scheduler ends within 3.1% of always-edge and cannot be shown to improve on it; the original design’s headline numbers (99.4% accuracy, 41.8% latency reduction) came from synthetic labels and leaky evaluation and were in fact a 35.6% slowdown. When a compute asymmetry is created (a 0.5-CPU edge against a 4-CPU cloud worker, simulated 110 ms delay), the same pipeline finishes 591 scripts 6.9% faster than always-edge (95% interval −10.8% to −3.8%) and recovers about half of the oracle’s gain. Whether that carries over to a real cloud link is the open question, and the repository contains the tooling and protocol to answer it.</w:t>
       </w:r>
     </w:p>
     <w:p>
@@ -4344,7 +4774,7 @@
         <w:t xml:space="preserve"> </w:t>
       </w:r>
       <w:r>
-        <w:t xml:space="preserve">Run the asymmetric-hardware experiment; evaluate the full scheduler on unseen workloads with two-node measurements; extend the analyser to infer bounds from</w:t>
+        <w:t xml:space="preserve">Repeat the container experiment and add the heavy multi-core workloads; measure against a real remote instance; evaluate the full scheduler on unseen workloads with two-node measurements; extend the analyser to infer bounds from</w:t>
       </w:r>
       <w:r>
         <w:t xml:space="preserve"> </w:t>
@@ -4369,8 +4799,8 @@
         </w:pict>
       </w:r>
     </w:p>
-    <w:bookmarkEnd w:id="44"/>
-    <w:bookmarkStart w:id="45" w:name="references"/>
+    <w:bookmarkEnd w:id="45"/>
+    <w:bookmarkStart w:id="46" w:name="references"/>
     <w:p>
       <w:pPr>
         <w:pStyle w:val="Heading2"/>
@@ -5656,8 +6086,8 @@
         <w:t xml:space="preserve">, vol. 39, no. 11, pp. 3840–3852, Nov. 2020.</w:t>
       </w:r>
     </w:p>
-    <w:bookmarkEnd w:id="45"/>
     <w:bookmarkEnd w:id="46"/>
+    <w:bookmarkEnd w:id="47"/>
     <w:sectPr/>
   </w:body>
 </w:document>
@@ -5971,6 +6401,9 @@
     <w:abstractNumId w:val="991"/>
   </w:num>
   <w:num w:numId="1006">
+    <w:abstractNumId w:val="991"/>
+  </w:num>
+  <w:num w:numId="1007">
     <w:abstractNumId w:val="99411"/>
     <w:lvlOverride w:ilvl="0">
       <w:startOverride w:val="1"/>
@@ -6000,7 +6433,7 @@
       <w:startOverride w:val="1"/>
     </w:lvlOverride>
   </w:num>
-  <w:num w:numId="1007">
+  <w:num w:numId="1008">
     <w:abstractNumId w:val="991"/>
   </w:num>
 </w:numbering>

</xml_diff>

<commit_message>
Measure the 42 heavy workloads and merge them: scheduler -23.9% vs always-edge
633 scripts on the same 0.5-CPU edge / 4-CPU cloud containers. Bootstrap 95% CI
[-31.4%, -17.2%] (scripts), [-45.0%, -10.3%] (families); 0.6% from the oracle.
The figure depends on a workload mix written to favour the cloud, and the
single-thread loops are not a clean control (a 0.5-CPU quota halves
single-thread speed). Paper, README, CHANGES updated; docx rebuilt.

Co-Authored-By: Claude Sonnet 5.5 <noreply@anthropic.com>
Claude-Session: https://claude.ai/code/session_015u77xGx1udYkoPxjjKpJ3X
</commit_message>
<xml_diff>
--- a/AI_Scheduler_Journal_Paper.docx
+++ b/AI_Scheduler_Journal_Paper.docx
@@ -256,7 +256,7 @@
         <w:t xml:space="preserve"> </w:t>
       </w:r>
       <w:r>
-        <w:t xml:space="preserve">than always-edge on the same scripts. On 16 hand-written scripts the generator never produced, the static complexity estimate has a Spearman rank correlation of 0.39 with measured runtime, which is useful but weak. We then create the missing asymmetry: with one worker limited to 0.5 CPU and another to 4 CPUs, both in containers on one machine and a simulated 110 ms network delay, the cloud wins on 61 of 591 scripts and the scheduler finishes the workload 6.9% faster than always-edge (254.8 s vs 273.7 s; 95% bootstrap interval −10.8% to −3.8% resampling scripts, −18.5% to −1.8% resampling script families; oracle 237.8 s). This is a controlled compute asymmetry, not a measurement on EC2.</w:t>
+        <w:t xml:space="preserve">than always-edge on the same scripts. On 16 hand-written scripts the generator never produced, the static complexity estimate has a Spearman rank correlation of 0.39 with measured runtime, which is useful but weak. We then create the missing asymmetry: with one worker limited to 0.5 CPU and another to 4 CPUs, both in containers on one machine and a simulated 110 ms network delay, the cloud wins on 61 of 591 scripts and the scheduler finishes the workload 6.9% faster than always-edge (254.8 s vs 273.7 s; 95% bootstrap interval −10.8% to −3.8% resampling scripts, −18.5% to −1.8% resampling script families; oracle 237.8 s). Adding 42 heavy linear-algebra, FFT and element-wise workloads raises the saving to 23.9% and brings the scheduler within 0.6% of the oracle, a figure that depends on that workload mix. These are controlled compute asymmetries, not measurements on EC2.</w:t>
       </w:r>
     </w:p>
     <w:p>
@@ -4211,6 +4211,293 @@
         <w:pStyle w:val="FirstParagraph"/>
       </w:pPr>
       <w:r>
+        <w:rPr>
+          <w:bCs/>
+          <w:b/>
+        </w:rPr>
+        <w:t xml:space="preserve">Heavy-workload extension.</w:t>
+      </w:r>
+      <w:r>
+        <w:t xml:space="preserve"> </w:t>
+      </w:r>
+      <w:r>
+        <w:t xml:space="preserve">The 591 scripts are mostly millisecond jobs, so the gain above is small in absolute terms. We added 42 scripts written for this purpose (</w:t>
+      </w:r>
+      <w:r>
+        <w:rPr>
+          <w:rStyle w:val="VerbatimChar"/>
+        </w:rPr>
+        <w:t xml:space="preserve">generate_heavy_scripts.py</w:t>
+      </w:r>
+      <w:r>
+        <w:t xml:space="preserve">: dense matmul, solve, inverse, eigenvalues and SVD at 400–4000 per side; FFT of 2¹⁸–2²³ points; large element-wise NumPy; and four single-threaded Python loops) and timed them on the same two workers (</w:t>
+      </w:r>
+      <w:r>
+        <w:rPr>
+          <w:rStyle w:val="VerbatimChar"/>
+        </w:rPr>
+        <w:t xml:space="preserve">data/docker_asym_v1b</w:t>
+      </w:r>
+      <w:r>
+        <w:t xml:space="preserve">, merged into</w:t>
+      </w:r>
+      <w:r>
+        <w:t xml:space="preserve"> </w:t>
+      </w:r>
+      <w:r>
+        <w:rPr>
+          <w:rStyle w:val="VerbatimChar"/>
+        </w:rPr>
+        <w:t xml:space="preserve">data/docker_asym_v2</w:t>
+      </w:r>
+      <w:r>
+        <w:t xml:space="preserve">, 633 scripts, 29 families). Cloud-over-edge speed-up (median per group) is 4.5–5.7× for matmul, solve and inverse, about 2.1–2.2× for eigenvalues, SVD, FFT and element-wise work, and 2.0× for the single-threaded loops. The last is not a clean control: a 0.5-CPU quota also halves single-thread speed, so these workers differ by 2× before any parallelism helps. On the merged set (out of fold, whole families held out, simulated 110 ms delay):</w:t>
+      </w:r>
+    </w:p>
+    <w:tbl>
+      <w:tblPr>
+        <w:tblStyle w:val="Table"/>
+        <w:tblW w:type="auto" w:w="0"/>
+        <w:tblLook w:firstRow="1" w:lastRow="0" w:firstColumn="0" w:lastColumn="0" w:noHBand="0" w:noVBand="0" w:val="0020"/>
+        <w:jc w:val="start"/>
+      </w:tblPr>
+      <w:tblGrid>
+        <w:gridCol w:w="2640"/>
+        <w:gridCol w:w="2640"/>
+        <w:gridCol w:w="2640"/>
+      </w:tblGrid>
+      <w:tr>
+        <w:trPr>
+          <w:tblHeader w:val="true"/>
+        </w:trPr>
+        <w:tc>
+          <w:tcPr/>
+          <w:p>
+            <w:pPr>
+              <w:pStyle w:val="Compact"/>
+              <w:jc w:val="left"/>
+            </w:pPr>
+            <w:r>
+              <w:t xml:space="preserve">Policy</w:t>
+            </w:r>
+          </w:p>
+        </w:tc>
+        <w:tc>
+          <w:tcPr/>
+          <w:p>
+            <w:pPr>
+              <w:pStyle w:val="Compact"/>
+              <w:jc w:val="right"/>
+            </w:pPr>
+            <w:r>
+              <w:t xml:space="preserve">Total (s)</w:t>
+            </w:r>
+          </w:p>
+        </w:tc>
+        <w:tc>
+          <w:tcPr/>
+          <w:p>
+            <w:pPr>
+              <w:pStyle w:val="Compact"/>
+              <w:jc w:val="right"/>
+            </w:pPr>
+            <w:r>
+              <w:t xml:space="preserve">vs always-edge</w:t>
+            </w:r>
+          </w:p>
+        </w:tc>
+      </w:tr>
+      <w:tr>
+        <w:tc>
+          <w:tcPr/>
+          <w:p>
+            <w:pPr>
+              <w:pStyle w:val="Compact"/>
+              <w:jc w:val="left"/>
+            </w:pPr>
+            <w:r>
+              <w:t xml:space="preserve">Oracle</w:t>
+            </w:r>
+          </w:p>
+        </w:tc>
+        <w:tc>
+          <w:tcPr/>
+          <w:p>
+            <w:pPr>
+              <w:pStyle w:val="Compact"/>
+              <w:jc w:val="right"/>
+            </w:pPr>
+            <w:r>
+              <w:t xml:space="preserve">262.8</w:t>
+            </w:r>
+          </w:p>
+        </w:tc>
+        <w:tc>
+          <w:tcPr/>
+          <w:p>
+            <w:pPr>
+              <w:pStyle w:val="Compact"/>
+              <w:jc w:val="right"/>
+            </w:pPr>
+            <w:r>
+              <w:t xml:space="preserve">−24.4%</w:t>
+            </w:r>
+          </w:p>
+        </w:tc>
+      </w:tr>
+      <w:tr>
+        <w:tc>
+          <w:tcPr/>
+          <w:p>
+            <w:pPr>
+              <w:pStyle w:val="Compact"/>
+              <w:jc w:val="left"/>
+            </w:pPr>
+            <w:r>
+              <w:rPr>
+                <w:bCs/>
+                <w:b/>
+              </w:rPr>
+              <w:t xml:space="preserve">Scheduler</w:t>
+            </w:r>
+          </w:p>
+        </w:tc>
+        <w:tc>
+          <w:tcPr/>
+          <w:p>
+            <w:pPr>
+              <w:pStyle w:val="Compact"/>
+              <w:jc w:val="right"/>
+            </w:pPr>
+            <w:r>
+              <w:rPr>
+                <w:bCs/>
+                <w:b/>
+              </w:rPr>
+              <w:t xml:space="preserve">264.5</w:t>
+            </w:r>
+          </w:p>
+        </w:tc>
+        <w:tc>
+          <w:tcPr/>
+          <w:p>
+            <w:pPr>
+              <w:pStyle w:val="Compact"/>
+              <w:jc w:val="right"/>
+            </w:pPr>
+            <w:r>
+              <w:rPr>
+                <w:bCs/>
+                <w:b/>
+              </w:rPr>
+              <w:t xml:space="preserve">−23.9%</w:t>
+            </w:r>
+          </w:p>
+        </w:tc>
+      </w:tr>
+      <w:tr>
+        <w:tc>
+          <w:tcPr/>
+          <w:p>
+            <w:pPr>
+              <w:pStyle w:val="Compact"/>
+              <w:jc w:val="left"/>
+            </w:pPr>
+            <w:r>
+              <w:t xml:space="preserve">Always cloud</w:t>
+            </w:r>
+          </w:p>
+        </w:tc>
+        <w:tc>
+          <w:tcPr/>
+          <w:p>
+            <w:pPr>
+              <w:pStyle w:val="Compact"/>
+              <w:jc w:val="right"/>
+            </w:pPr>
+            <w:r>
+              <w:t xml:space="preserve">316.0</w:t>
+            </w:r>
+          </w:p>
+        </w:tc>
+        <w:tc>
+          <w:tcPr/>
+          <w:p>
+            <w:pPr>
+              <w:pStyle w:val="Compact"/>
+              <w:jc w:val="right"/>
+            </w:pPr>
+            <w:r>
+              <w:t xml:space="preserve">−9.1%</w:t>
+            </w:r>
+          </w:p>
+        </w:tc>
+      </w:tr>
+      <w:tr>
+        <w:tc>
+          <w:tcPr/>
+          <w:p>
+            <w:pPr>
+              <w:pStyle w:val="Compact"/>
+              <w:jc w:val="left"/>
+            </w:pPr>
+            <w:r>
+              <w:t xml:space="preserve">Always edge</w:t>
+            </w:r>
+          </w:p>
+        </w:tc>
+        <w:tc>
+          <w:tcPr/>
+          <w:p>
+            <w:pPr>
+              <w:pStyle w:val="Compact"/>
+              <w:jc w:val="right"/>
+            </w:pPr>
+            <w:r>
+              <w:t xml:space="preserve">347.5</w:t>
+            </w:r>
+          </w:p>
+        </w:tc>
+        <w:tc>
+          <w:tcPr/>
+          <w:p>
+            <w:pPr>
+              <w:pStyle w:val="Compact"/>
+              <w:jc w:val="right"/>
+            </w:pPr>
+            <w:r>
+              <w:t xml:space="preserve">baseline</w:t>
+            </w:r>
+          </w:p>
+        </w:tc>
+      </w:tr>
+    </w:tbl>
+    <w:p>
+      <w:pPr>
+        <w:pStyle w:val="BodyText"/>
+      </w:pPr>
+      <w:r>
+        <w:t xml:space="preserve">The scheduler routed 93 scripts to the cloud (99 favour it), saved 83.5 s on 84 scripts and lost 0.5 s on 9, and ends 0.6% from the oracle. The 95% bootstrap interval for its saving over always-edge is [−31.4%, −17.2%] resampling scripts and [−45.0%, −10.3%] resampling families. R² is 0.965 (edge) and 0.973 (cloud).</w:t>
+      </w:r>
+      <w:r>
+        <w:t xml:space="preserve"> </w:t>
+      </w:r>
+      <w:r>
+        <w:rPr>
+          <w:bCs/>
+          <w:b/>
+        </w:rPr>
+        <w:t xml:space="preserve">This figure depends on the workload mix we chose</w:t>
+      </w:r>
+      <w:r>
+        <w:t xml:space="preserve">: the heavy scripts were written to be cloud-favourable and make up 7% of the scripts but 21% of the edge time, and the held-out heavy families are easy to call (cloud faster for 38 of 42). It shows what happens when real work of that kind is present, not how often it is.</w:t>
+      </w:r>
+    </w:p>
+    <w:p>
+      <w:pPr>
+        <w:pStyle w:val="BodyText"/>
+      </w:pPr>
+      <w:r>
         <w:t xml:space="preserve">What this does and does not show. It shows that, given a real difference in compute, the pipeline (static features, regressors trained on measured times, the single inequality of Section 3.1) finds most of the available gain and avoids the penalty of always offloading. It does not show a gain on EC2: the asymmetry was chosen by us, the two workers share one machine and memory system, and the network delay is a constant rather than a measured, variable link.</w:t>
       </w:r>
     </w:p>
@@ -4425,7 +4712,7 @@
         <w:pStyle w:val="Compact"/>
       </w:pPr>
       <w:r>
-        <w:t xml:space="preserve">Repeat the container experiment two or three times (and with other CPU limits) to measure run-to-run variation, which the bootstrap interval does not cover.</w:t>
+        <w:t xml:space="preserve">Repeat the container experiment two or three times (and with other CPU limits, including one that gives the edge a full core so single-thread loops become a true control) to measure run-to-run variation, which the bootstrap interval does not cover.</w:t>
       </w:r>
     </w:p>
     <w:p>
@@ -4437,25 +4724,7 @@
         <w:pStyle w:val="Compact"/>
       </w:pPr>
       <w:r>
-        <w:t xml:space="preserve">Add the heavier multi-core workloads written for this purpose (</w:t>
-      </w:r>
-      <w:r>
-        <w:rPr>
-          <w:rStyle w:val="VerbatimChar"/>
-        </w:rPr>
-        <w:t xml:space="preserve">generate_heavy_scripts.py</w:t>
-      </w:r>
-      <w:r>
-        <w:t xml:space="preserve">: dense linear algebra, FFT, large element-wise NumPy, and single-threaded loops as a control) and merge them into the dataset (</w:t>
-      </w:r>
-      <w:r>
-        <w:rPr>
-          <w:rStyle w:val="VerbatimChar"/>
-        </w:rPr>
-        <w:t xml:space="preserve">scripts/merge_datasets.py</w:t>
-      </w:r>
-      <w:r>
-        <w:t xml:space="preserve">). Only 10% of scripts currently favour the cloud, mostly because most jobs finish in milliseconds.</w:t>
+        <w:t xml:space="preserve">Collect a workload mix from real users rather than our own templates, so the proportion of heavy jobs is not our choice.</w:t>
       </w:r>
     </w:p>
     <w:p>

</xml_diff>